<commit_message>
Update notebook, report and deck to final wording
Brings the deliverables to their final October 2026 state: readable chart labels, the PowerPoint chart-label fix, and two rounds of wording fixes so every claim matches what the analysis supports (for example, the adjusted gap is reported as no significant difference, not proof of fairness). Adds a PDF of the deck and a README with method, findings, limitations and project history.

Co-Authored-By: Claude Opus 5.5 <noreply@anthropic.com>
Claude-Session: https://claude.ai/code/session_0189oixY1HgZzrPqKf2HyBjs
</commit_message>
<xml_diff>
--- a/Workplace_Diversity_Analysis_Report.docx
+++ b/Workplace_Diversity_Analysis_Report.docx
@@ -78,7 +78,7 @@
         <w:spacing w:after="160"/>
       </w:pPr>
       <w:r>
-        <w:t xml:space="preserve">The Head of HR asked for an analysis of whether the company treats all employees fairly, using internal hierarchy and compensation data covering 10,000 employees. This report classifies every employee into one of six organizational levels, measures how many people each employee manages (directly and indirectly), builds a model of what drives salary, and tests whether pay is fair across gender.</w:t>
+        <w:t xml:space="preserve">The Head of HR asked for an analysis of whether the company treats all employees fairly, using internal hierarchy and compensation data covering 10,000 employees. This report classifies every employee into one of six organizational levels, measures how many people each employee manages (directly and indirectly), builds a model of what drives salary, and tests whether pay differs by gender after accounting for role.</w:t>
       </w:r>
     </w:p>
     <w:p>
@@ -86,7 +86,7 @@
         <w:spacing w:after="160"/>
       </w:pPr>
       <w:r>
-        <w:t xml:space="preserve">The headline finding is nuanced. There is a large raw pay gap between men and women (men earn about 14% more on average), and that gap is statistically significant. However, once we account for the department and level an employee sits in, the gap all but disappears — pay is equitable for people doing the same job at the same level. The real issue is representation: women are concentrated in the lowest-paying department (HR) and underrepresented in the highest-paying one (Engineering), and women who do reach senior levels have needed more years of experience to get there than men at the same level. In short, this is not an “equal pay for equal work” problem — it is a pipeline and promotion problem that shows up downstream as a pay gap.</w:t>
+        <w:t xml:space="preserve">The headline finding is nuanced. There is a large raw pay gap between men and women (men earn about 14% more on average), and that gap is statistically significant. However, once we account for the department and level an employee sits in, the gap all but disappears — we find no statistically significant pay gap within the same level and department. (A non-significant result is the absence of evidence of a gap, not proof of fairness; the data include no performance measure, so it cannot rule out differences driven by factors we did not observe.) The larger pattern is representation: a much larger share of women than men work in the lowest-paying department (HR), a smaller share work in the highest-paying one (Engineering), and women who do reach senior levels have needed more years of experience to get there than men at the same level. In short, the data point to a pipeline and promotion pattern that shows up downstream as a pay gap, rather than a gap within the same role.</w:t>
       </w:r>
     </w:p>
     <w:p>
@@ -218,7 +218,7 @@
           </w:tcPr>
           <w:p>
             <w:r>
-              <w:t xml:space="preserve">–$703 (not statistically significant, p = 0.65) after controlling for level, department, degree, experience, signing bonus</w:t>
+              <w:t xml:space="preserve">–$703 (no significant gap, p = 0.65) within the same level and department, controlling also for degree, experience, signing bonus; no performance control</w:t>
             </w:r>
           </w:p>
         </w:tc>
@@ -231,7 +231,7 @@
           </w:tcPr>
           <w:p>
             <w:r>
-              <w:t xml:space="preserve">Women in Engineering (highest-paid dept.)</w:t>
+              <w:t xml:space="preserve">Share working in Engineering (highest-paid dept.)</w:t>
             </w:r>
           </w:p>
         </w:tc>
@@ -255,7 +255,7 @@
           </w:tcPr>
           <w:p>
             <w:r>
-              <w:t xml:space="preserve">Women in HR (lowest-paid dept.)</w:t>
+              <w:t xml:space="preserve">Share working in HR (lowest-paid dept.)</w:t>
             </w:r>
           </w:p>
         </w:tc>
@@ -279,7 +279,7 @@
           </w:tcPr>
           <w:p>
             <w:r>
-              <w:t xml:space="preserve">Women reaching Director level or above</w:t>
+              <w:t xml:space="preserve">Share reaching Director level or above</w:t>
             </w:r>
           </w:p>
         </w:tc>
@@ -290,7 +290,7 @@
           </w:tcPr>
           <w:p>
             <w:r>
-              <w:t xml:space="preserve">1.60% vs. 2.21% of men (p = 0.038)</w:t>
+              <w:t xml:space="preserve">1.60% of women vs. 2.21% of men (p = 0.038)</w:t>
             </w:r>
           </w:p>
         </w:tc>
@@ -387,7 +387,7 @@
         <w:spacing w:after="160"/>
       </w:pPr>
       <w:r>
-        <w:t xml:space="preserve">Both tables cover the same 10,000 employees with no missing values (aside from the CEO's boss_id, which is null by definition) and no duplicate IDs. All analysis and modeling was performed in Python (pandas / numpy); the regression model was implemented directly with matrix algebra (ordinary least squares via the normal equations) since the sandboxed analysis environment did not have internet access to install scikit-learn or statsmodels. Statistical significance was assessed using the standard normal approximation, which is very accurate at this sample size (n ≈ 10,000).</w:t>
+        <w:t xml:space="preserve">Both tables cover the same 10,000 employees with no missing values (aside from the CEO's boss_id, which is null by definition) and no duplicate IDs. All analysis and modeling was performed in Python (pandas / numpy); the regression model (ordinary least squares via the normal equations) was implemented directly in NumPy. Statistical significance was assessed using the standard normal approximation, which is very accurate at this sample size (n ≈ 10,000).</w:t>
       </w:r>
     </w:p>
     <w:p>
@@ -1242,7 +1242,7 @@
         <w:spacing w:after="160"/>
       </w:pPr>
       <w:r>
-        <w:t xml:space="preserve">Correlation of numeric factors with salary: years of experience (r = 0.05), total people managed (r = 0.10), signing bonus (r = 0.11) — all weak. This is the first sign that level and department, not tenure or credentials, are the dominant pay drivers at this company.</w:t>
+        <w:t xml:space="preserve">Correlation of numeric factors with salary: years of experience (r = 0.05), total people managed (r = 0.10), signing bonus (r = 0.11) — all weak. This is the first sign that level and department, not experience or credentials, are the dominant pay drivers at this company.</w:t>
       </w:r>
     </w:p>
     <w:p>
@@ -1769,7 +1769,7 @@
         <w:spacing w:after="160"/>
       </w:pPr>
       <w:r>
-        <w:t xml:space="preserve">The takeaway: level and department overwhelmingly determine pay. Degree, tenure, and signing bonus have no measurable effect once level and department are accounted for. And critically, sex has no statistically significant effect on pay once level and department are held constant.</w:t>
+        <w:t xml:space="preserve">The takeaway: level and department overwhelmingly determine pay. Degree, experience, and signing bonus show no significant effect once level and department are accounted for. Likewise, sex has no statistically significant effect on pay once level and department are held constant.</w:t>
       </w:r>
     </w:p>
     <w:p>
@@ -1792,7 +1792,7 @@
         <w:spacing w:after="120" w:before="260"/>
       </w:pPr>
       <w:r>
-        <w:t xml:space="preserve">5.1 The raw pay gap is real — but it is not a same-job pay gap</w:t>
+        <w:t xml:space="preserve">5.1 The raw pay gap is real — but no significant gap remains within level and department</w:t>
       </w:r>
     </w:p>
     <w:p>
@@ -1800,7 +1800,7 @@
         <w:spacing w:after="160"/>
       </w:pPr>
       <w:r>
-        <w:t xml:space="preserve">Women earn $171,315 on average versus $198,954 for men — a $27,562 (14.0%) gap that is highly statistically significant (p &lt; 0.001). But when we compare men and women at the same level in the same department, that gap shrinks to –$703 and is no longer statistically distinguishable from zero (p = 0.65, and the same holds in a level+department-only version of the model, p = 0.60). This means two employees doing the same job at the same level are paid equivalently regardless of sex.</w:t>
+        <w:t xml:space="preserve">Women earn $171,315 on average versus $198,954 for men — a $27,562 (14.0%) gap that is highly statistically significant (p &lt; 0.001). But when we compare men and women at the same level in the same department, that gap shrinks to –$703 and is no longer statistically distinguishable from zero (p = 0.65, and the same holds in a level+department-only version of the model, p = 0.60). This means we find no significant gap between men and women within the same level and department. Because the data contain no performance measure, this does not prove pay is fair; it shows that, among the factors we can observe, sex does not explain pay once role is held constant.</w:t>
       </w:r>
     </w:p>
     <w:p>
@@ -1809,7 +1809,7 @@
         <w:spacing w:after="120" w:before="260"/>
       </w:pPr>
       <w:r>
-        <w:t xml:space="preserve">5.2 The real gap is in representation, not pay rate</w:t>
+        <w:t xml:space="preserve">5.2 The larger difference is in representation</w:t>
       </w:r>
     </w:p>
     <w:p>
@@ -1863,7 +1863,7 @@
         <w:spacing w:after="160"/>
       </w:pPr>
       <w:r>
-        <w:t xml:space="preserve">Women are significantly overrepresented in HR, the lowest-paying department (29.7% of women work in HR vs. 9.9% of men), and significantly underrepresented in Engineering, the highest-paying department (18.8% of women vs. 31.4% of men). Both differences are highly significant (p &lt; 0.001). Because department is one of the two strongest drivers of pay, this distribution alone explains most of the raw gap.</w:t>
+        <w:t xml:space="preserve">A far larger share of women than men work in HR, the lowest-paying department (29.7% of women vs. 9.9% of men), and a smaller share work in Engineering, the highest-paying department (18.8% of women vs. 31.4% of men). Both differences are highly significant (p &lt; 0.001). These are shares within each sex, not the share of each department that is female. Because department is one of the two strongest drivers of pay, this distribution alone explains most of the raw gap.</w:t>
       </w:r>
     </w:p>
     <w:p>
@@ -1917,7 +1917,7 @@
         <w:spacing w:after="160"/>
       </w:pPr>
       <w:r>
-        <w:t xml:space="preserve">Women are also modestly underrepresented in leadership: 1.60% of women hold a Director-level role or above, versus 2.21% of men (p = 0.038).</w:t>
+        <w:t xml:space="preserve">A smaller share of women also reach leadership: 1.60% of women hold a Director-level role or above, versus 2.21% of men (p = 0.038).</w:t>
       </w:r>
     </w:p>
     <w:p>
@@ -1926,7 +1926,7 @@
         <w:spacing w:after="120" w:before="260"/>
       </w:pPr>
       <w:r>
-        <w:t xml:space="preserve">5.3 A promotion / tenure gap compounds the issue</w:t>
+        <w:t xml:space="preserve">5.3 Senior women have more experience than senior men</w:t>
       </w:r>
     </w:p>
     <w:p>
@@ -1980,7 +1980,7 @@
         <w:spacing w:after="160"/>
       </w:pPr>
       <w:r>
-        <w:t xml:space="preserve">Among employees who do reach senior levels, women have notably more years of experience than men at the same level: 16.5 years vs. 12.9 years at Director, and 25.6 vs. 19.0 years at VP. Women appear to need meaningfully more tenure to reach the same rung of the ladder — a classic glass-ceiling pattern, even though pay at that rung is equitable once reached.</w:t>
+        <w:t xml:space="preserve">Among employees currently at senior levels, women have more years of experience on average than men at the same level: 16.5 years vs. 12.9 years at Director, and 25.6 vs. 19.0 years at VP (these differences were not significance-tested). This snapshot shows experience at each level, not how long promotion took, so it is a flag for follow-up with promotion-timing data rather than evidence of a glass ceiling. The adjusted model finds no significant pay gap once level and department are held constant.</w:t>
       </w:r>
     </w:p>
     <w:p>
@@ -2014,7 +2014,7 @@
         <w:t xml:space="preserve">Do not stop at “equal pay for equal role.”</w:t>
       </w:r>
       <w:r>
-        <w:t xml:space="preserve"> The compensation model itself looks fair — but that finding can mask the real issue, which is structural: who gets into which department, and who gets promoted, and how fast.</w:t>
+        <w:t xml:space="preserve"> The compensation model finds no significant gap within level and department — but that is not proof of fairness (no performance control), and it can mask the structural issue: who gets into which department, who gets promoted, and how fast.</w:t>
       </w:r>
     </w:p>
     <w:p>
@@ -2034,7 +2034,7 @@
         <w:t xml:space="preserve">Investigate the Engineering pipeline.</w:t>
       </w:r>
       <w:r>
-        <w:t xml:space="preserve"> Audit hiring, internal transfer, and retention funnels into Engineering (the highest-paying department) to understand why women are so underrepresented there relative to HR, Sales, and Marketing.</w:t>
+        <w:t xml:space="preserve"> Audit hiring, internal transfer, and retention funnels into Engineering (the highest-paying department) to understand why a smaller share of women than men work in Engineering, relative to HR, Sales, and Marketing.</w:t>
       </w:r>
     </w:p>
     <w:p>

</xml_diff>